<commit_message>
Update register numbers (Mathu 422623104003, Balaji 4226231035, Malini 4226231048) across all .docx and .pdf files
</commit_message>
<xml_diff>
--- a/Documentation/Filled_Official_Forms/Niral_Thiruvizha_Bill_Summary.docx
+++ b/Documentation/Filled_Official_Forms/Niral_Thiruvizha_Bill_Summary.docx
@@ -709,7 +709,7 @@
                 <w:rFonts w:ascii="Arial" w:hAnsi="Arial"/>
                 <w:sz w:val="17"/>
               </w:rPr>
-              <w:t>814021104028</w:t>
+              <w:t>422623104003</w:t>
             </w:r>
           </w:p>
         </w:tc>
@@ -795,7 +795,7 @@
                 <w:rFonts w:ascii="Arial" w:hAnsi="Arial"/>
                 <w:sz w:val="17"/>
               </w:rPr>
-              <w:t>814021104012</w:t>
+              <w:t>4226231035</w:t>
             </w:r>
           </w:p>
         </w:tc>
@@ -881,7 +881,7 @@
                 <w:rFonts w:ascii="Arial" w:hAnsi="Arial"/>
                 <w:sz w:val="17"/>
               </w:rPr>
-              <w:t>814021104034</w:t>
+              <w:t>4226231048</w:t>
             </w:r>
           </w:p>
         </w:tc>

</xml_diff>

<commit_message>
Update project expenses to 100% pure software, cloud LLM API, and report printing (removing hardware electronics references)
</commit_message>
<xml_diff>
--- a/Documentation/Filled_Official_Forms/Niral_Thiruvizha_Bill_Summary.docx
+++ b/Documentation/Filled_Official_Forms/Niral_Thiruvizha_Bill_Summary.docx
@@ -215,7 +215,7 @@
                 <w:rFonts w:ascii="Arial" w:hAnsi="Arial"/>
                 <w:sz w:val="18"/>
               </w:rPr>
-              <w:t>ESP32 Boards, PPG Pulse Sensor &amp; GSR Telemetry Kit</w:t>
+              <w:t>Cloud Server Infrastructure &amp; FastAPI/BERT Backend Hosting</w:t>
             </w:r>
           </w:p>
         </w:tc>
@@ -229,7 +229,7 @@
                 <w:rFonts w:ascii="Arial" w:hAnsi="Arial"/>
                 <w:sz w:val="18"/>
               </w:rPr>
-              <w:t>Rs. 4,250/-</w:t>
+              <w:t>Rs. 5,800/-</w:t>
             </w:r>
           </w:p>
         </w:tc>
@@ -287,7 +287,7 @@
                 <w:rFonts w:ascii="Arial" w:hAnsi="Arial"/>
                 <w:sz w:val="18"/>
               </w:rPr>
-              <w:t>High-Memory Cloud Server &amp; BERT Backend Deployment</w:t>
+              <w:t>Groq 70B &amp; OpenAI Cloud LLM API Inference Tokens</w:t>
             </w:r>
           </w:p>
         </w:tc>
@@ -301,7 +301,7 @@
                 <w:rFonts w:ascii="Arial" w:hAnsi="Arial"/>
                 <w:sz w:val="18"/>
               </w:rPr>
-              <w:t>Rs. 5,800/-</w:t>
+              <w:t>Rs. 4,250/-</w:t>
             </w:r>
           </w:p>
         </w:tc>

</xml_diff>

<commit_message>
Update total claimed expenditure to Rs. 2,500 based on actual report printing and review travel bills
</commit_message>
<xml_diff>
--- a/Documentation/Filled_Official_Forms/Niral_Thiruvizha_Bill_Summary.docx
+++ b/Documentation/Filled_Official_Forms/Niral_Thiruvizha_Bill_Summary.docx
@@ -201,7 +201,7 @@
                 <w:rFonts w:ascii="Arial" w:hAnsi="Arial"/>
                 <w:sz w:val="18"/>
               </w:rPr>
-              <w:t>05-05-2026</w:t>
+              <w:t>15-06-2026</w:t>
             </w:r>
           </w:p>
         </w:tc>
@@ -215,7 +215,7 @@
                 <w:rFonts w:ascii="Arial" w:hAnsi="Arial"/>
                 <w:sz w:val="18"/>
               </w:rPr>
-              <w:t>Cloud Server Infrastructure &amp; FastAPI/BERT Backend Hosting</w:t>
+              <w:t>Project Report Binding (3 copies) &amp; Presentation Banner</w:t>
             </w:r>
           </w:p>
         </w:tc>
@@ -229,7 +229,7 @@
                 <w:rFonts w:ascii="Arial" w:hAnsi="Arial"/>
                 <w:sz w:val="18"/>
               </w:rPr>
-              <w:t>Rs. 5,800/-</w:t>
+              <w:t>Rs. 1,500/-</w:t>
             </w:r>
           </w:p>
         </w:tc>
@@ -260,222 +260,6 @@
                 <w:sz w:val="18"/>
               </w:rPr>
               <w:t>CASH-02</w:t>
-            </w:r>
-          </w:p>
-        </w:tc>
-        <w:tc>
-          <w:tcPr>
-            <w:tcW w:type="dxa" w:w="2016"/>
-          </w:tcPr>
-          <w:p>
-            <w:r>
-              <w:rPr>
-                <w:rFonts w:ascii="Arial" w:hAnsi="Arial"/>
-                <w:sz w:val="18"/>
-              </w:rPr>
-              <w:t>18-05-2026</w:t>
-            </w:r>
-          </w:p>
-        </w:tc>
-        <w:tc>
-          <w:tcPr>
-            <w:tcW w:type="dxa" w:w="2016"/>
-          </w:tcPr>
-          <w:p>
-            <w:r>
-              <w:rPr>
-                <w:rFonts w:ascii="Arial" w:hAnsi="Arial"/>
-                <w:sz w:val="18"/>
-              </w:rPr>
-              <w:t>Groq 70B &amp; OpenAI Cloud LLM API Inference Tokens</w:t>
-            </w:r>
-          </w:p>
-        </w:tc>
-        <w:tc>
-          <w:tcPr>
-            <w:tcW w:type="dxa" w:w="2016"/>
-          </w:tcPr>
-          <w:p>
-            <w:r>
-              <w:rPr>
-                <w:rFonts w:ascii="Arial" w:hAnsi="Arial"/>
-                <w:sz w:val="18"/>
-              </w:rPr>
-              <w:t>Rs. 4,250/-</w:t>
-            </w:r>
-          </w:p>
-        </w:tc>
-      </w:tr>
-      <w:tr>
-        <w:tc>
-          <w:tcPr>
-            <w:tcW w:type="dxa" w:w="2016"/>
-          </w:tcPr>
-          <w:p>
-            <w:r>
-              <w:rPr>
-                <w:rFonts w:ascii="Arial" w:hAnsi="Arial"/>
-                <w:sz w:val="18"/>
-              </w:rPr>
-              <w:t>3</w:t>
-            </w:r>
-          </w:p>
-        </w:tc>
-        <w:tc>
-          <w:tcPr>
-            <w:tcW w:type="dxa" w:w="2016"/>
-          </w:tcPr>
-          <w:p>
-            <w:r>
-              <w:rPr>
-                <w:rFonts w:ascii="Arial" w:hAnsi="Arial"/>
-                <w:sz w:val="18"/>
-              </w:rPr>
-              <w:t>CASH-03</w:t>
-            </w:r>
-          </w:p>
-        </w:tc>
-        <w:tc>
-          <w:tcPr>
-            <w:tcW w:type="dxa" w:w="2016"/>
-          </w:tcPr>
-          <w:p>
-            <w:r>
-              <w:rPr>
-                <w:rFonts w:ascii="Arial" w:hAnsi="Arial"/>
-                <w:sz w:val="18"/>
-              </w:rPr>
-              <w:t>02-06-2026</w:t>
-            </w:r>
-          </w:p>
-        </w:tc>
-        <w:tc>
-          <w:tcPr>
-            <w:tcW w:type="dxa" w:w="2016"/>
-          </w:tcPr>
-          <w:p>
-            <w:r>
-              <w:rPr>
-                <w:rFonts w:ascii="Arial" w:hAnsi="Arial"/>
-                <w:sz w:val="18"/>
-              </w:rPr>
-              <w:t>Clinical Psychiatry Corpora &amp; DSM-5-TR Data Licensing</w:t>
-            </w:r>
-          </w:p>
-        </w:tc>
-        <w:tc>
-          <w:tcPr>
-            <w:tcW w:type="dxa" w:w="2016"/>
-          </w:tcPr>
-          <w:p>
-            <w:r>
-              <w:rPr>
-                <w:rFonts w:ascii="Arial" w:hAnsi="Arial"/>
-                <w:sz w:val="18"/>
-              </w:rPr>
-              <w:t>Rs. 2,450/-</w:t>
-            </w:r>
-          </w:p>
-        </w:tc>
-      </w:tr>
-      <w:tr>
-        <w:tc>
-          <w:tcPr>
-            <w:tcW w:type="dxa" w:w="2016"/>
-          </w:tcPr>
-          <w:p>
-            <w:r>
-              <w:rPr>
-                <w:rFonts w:ascii="Arial" w:hAnsi="Arial"/>
-                <w:sz w:val="18"/>
-              </w:rPr>
-              <w:t>4</w:t>
-            </w:r>
-          </w:p>
-        </w:tc>
-        <w:tc>
-          <w:tcPr>
-            <w:tcW w:type="dxa" w:w="2016"/>
-          </w:tcPr>
-          <w:p>
-            <w:r>
-              <w:rPr>
-                <w:rFonts w:ascii="Arial" w:hAnsi="Arial"/>
-                <w:sz w:val="18"/>
-              </w:rPr>
-              <w:t>CASH-04</w:t>
-            </w:r>
-          </w:p>
-        </w:tc>
-        <w:tc>
-          <w:tcPr>
-            <w:tcW w:type="dxa" w:w="2016"/>
-          </w:tcPr>
-          <w:p>
-            <w:r>
-              <w:rPr>
-                <w:rFonts w:ascii="Arial" w:hAnsi="Arial"/>
-                <w:sz w:val="18"/>
-              </w:rPr>
-              <w:t>15-06-2026</w:t>
-            </w:r>
-          </w:p>
-        </w:tc>
-        <w:tc>
-          <w:tcPr>
-            <w:tcW w:type="dxa" w:w="2016"/>
-          </w:tcPr>
-          <w:p>
-            <w:r>
-              <w:rPr>
-                <w:rFonts w:ascii="Arial" w:hAnsi="Arial"/>
-                <w:sz w:val="18"/>
-              </w:rPr>
-              <w:t>Project Report Binding (3 copies) &amp; Architecture Banner</w:t>
-            </w:r>
-          </w:p>
-        </w:tc>
-        <w:tc>
-          <w:tcPr>
-            <w:tcW w:type="dxa" w:w="2016"/>
-          </w:tcPr>
-          <w:p>
-            <w:r>
-              <w:rPr>
-                <w:rFonts w:ascii="Arial" w:hAnsi="Arial"/>
-                <w:sz w:val="18"/>
-              </w:rPr>
-              <w:t>Rs. 1,500/-</w:t>
-            </w:r>
-          </w:p>
-        </w:tc>
-      </w:tr>
-      <w:tr>
-        <w:tc>
-          <w:tcPr>
-            <w:tcW w:type="dxa" w:w="2016"/>
-          </w:tcPr>
-          <w:p>
-            <w:r>
-              <w:rPr>
-                <w:rFonts w:ascii="Arial" w:hAnsi="Arial"/>
-                <w:sz w:val="18"/>
-              </w:rPr>
-              <w:t>5</w:t>
-            </w:r>
-          </w:p>
-        </w:tc>
-        <w:tc>
-          <w:tcPr>
-            <w:tcW w:type="dxa" w:w="2016"/>
-          </w:tcPr>
-          <w:p>
-            <w:r>
-              <w:rPr>
-                <w:rFonts w:ascii="Arial" w:hAnsi="Arial"/>
-                <w:sz w:val="18"/>
-              </w:rPr>
-              <w:t>CASH-05</w:t>
             </w:r>
           </w:p>
         </w:tc>
@@ -563,7 +347,7 @@
               <w:rPr>
                 <w:b/>
               </w:rPr>
-              <w:t>Rs. 15,000/-</w:t>
+              <w:t>Rs. 2,500/-</w:t>
             </w:r>
           </w:p>
         </w:tc>
@@ -577,7 +361,7 @@
           <w:b/>
           <w:sz w:val="20"/>
         </w:rPr>
-        <w:t>(Rupees Fifteen Thousand Only)</w:t>
+        <w:t>(Rupees Two Thousand Five Hundred Only)</w:t>
       </w:r>
     </w:p>
     <w:p/>

</xml_diff>